<commit_message>
Fix syntax error by removing stray fragment tag
</commit_message>
<xml_diff>
--- a/ماذا سنفعل في خطوة القادمة.docx
+++ b/ماذا سنفعل في خطوة القادمة.docx
@@ -4,259 +4,665 @@
   <w:body>
     <w:p>
       <w:pPr>
-        <w:rPr>
-          <w:b/>
-          <w:bCs/>
-        </w:rPr>
-      </w:pPr>
-      <w:r>
-        <w:rPr>
-          <w:b/>
-          <w:bCs/>
-          <w:rtl/>
-        </w:rPr>
-        <w:t>أين أصبحنا الآن على خارطة الطريق؟</w:t>
+        <w:bidi/>
+        <w:rPr>
+          <w:b/>
+          <w:bCs/>
+        </w:rPr>
+      </w:pPr>
+      <w:r>
+        <w:rPr>
+          <w:b/>
+          <w:bCs/>
+          <w:rtl/>
+        </w:rPr>
+        <w:t xml:space="preserve">أين أصبحنا الآن على خارطة </w:t>
+      </w:r>
+      <w:proofErr w:type="spellStart"/>
+      <w:proofErr w:type="gramStart"/>
+      <w:r>
+        <w:rPr>
+          <w:b/>
+          <w:bCs/>
+          <w:rtl/>
+        </w:rPr>
+        <w:t>الطريق؟</w:t>
+      </w:r>
+      <w:r>
+        <w:rPr>
+          <w:b/>
+          <w:bCs/>
+          <w:rtl/>
+        </w:rPr>
+        <w:t>ما</w:t>
+      </w:r>
+      <w:proofErr w:type="spellEnd"/>
+      <w:proofErr w:type="gramEnd"/>
+      <w:r>
+        <w:rPr>
+          <w:b/>
+          <w:bCs/>
+          <w:rtl/>
+        </w:rPr>
+        <w:t xml:space="preserve"> شاء الله، إنجاز ممتاز! تطبيق "خِزنتي" وصل لمرحلة متقدمة جداً ورائعة (</w:t>
+      </w:r>
+      <w:r>
+        <w:rPr>
+          <w:b/>
+          <w:bCs/>
+        </w:rPr>
+        <w:t>React</w:t>
+      </w:r>
+      <w:r>
+        <w:rPr>
+          <w:b/>
+          <w:bCs/>
+          <w:rtl/>
+        </w:rPr>
+        <w:t xml:space="preserve"> مع تنسيق وتجاوب ممتاز ورفع على السحاب).</w:t>
       </w:r>
     </w:p>
     <w:p>
       <w:pPr>
-        <w:rPr>
-          <w:b/>
-          <w:bCs/>
-          <w:rtl/>
-        </w:rPr>
-      </w:pPr>
-      <w:r>
-        <w:rPr>
-          <w:b/>
-          <w:bCs/>
-          <w:rtl/>
-        </w:rPr>
-        <w:t xml:space="preserve">بما أننا أنجزنا الرفع على </w:t>
-      </w:r>
-      <w:proofErr w:type="spellStart"/>
-      <w:r>
-        <w:rPr>
-          <w:b/>
-          <w:bCs/>
-        </w:rPr>
-        <w:t>Vercel</w:t>
-      </w:r>
-      <w:proofErr w:type="spellEnd"/>
-      <w:r>
-        <w:rPr>
-          <w:b/>
-          <w:bCs/>
-          <w:rtl/>
-        </w:rPr>
-        <w:t xml:space="preserve"> وأتقنا متغيرات الأمان (.</w:t>
-      </w:r>
-      <w:r>
-        <w:rPr>
-          <w:b/>
-          <w:bCs/>
-        </w:rPr>
-        <w:t>env</w:t>
-      </w:r>
-      <w:r>
-        <w:rPr>
-          <w:b/>
-          <w:bCs/>
-          <w:rtl/>
-        </w:rPr>
-        <w:t>) وربطناها، فإن موقفنا الحالي على الخارطة أصبح كالتالي:</w:t>
+        <w:bidi/>
+        <w:rPr>
+          <w:b/>
+          <w:bCs/>
+          <w:rtl/>
+        </w:rPr>
+      </w:pPr>
+      <w:r>
+        <w:rPr>
+          <w:b/>
+          <w:bCs/>
+          <w:rtl/>
+        </w:rPr>
+        <w:t>بناءً على الجدول الخاص بخارطة الطريق (</w:t>
+      </w:r>
+      <w:r>
+        <w:rPr>
+          <w:b/>
+          <w:bCs/>
+        </w:rPr>
+        <w:t>Roadmap</w:t>
+      </w:r>
+      <w:r>
+        <w:rPr>
+          <w:b/>
+          <w:bCs/>
+          <w:rtl/>
+        </w:rPr>
+        <w:t>)، فإن أهم خطوة قادمة ومباشرة يحتاجها تطبيقك الحالي هي:</w:t>
       </w:r>
     </w:p>
     <w:p>
       <w:pPr>
+        <w:bidi/>
+        <w:rPr>
+          <w:b/>
+          <w:bCs/>
+          <w:rtl/>
+        </w:rPr>
+      </w:pPr>
+      <w:r>
+        <w:rPr>
+          <w:b/>
+          <w:bCs/>
+          <w:rtl/>
+        </w:rPr>
+        <w:t xml:space="preserve">1. </w:t>
+      </w:r>
+      <w:r>
+        <w:rPr>
+          <w:rFonts w:ascii="Segoe UI Emoji" w:hAnsi="Segoe UI Emoji" w:cs="Segoe UI Emoji" w:hint="cs"/>
+          <w:b/>
+          <w:bCs/>
+          <w:rtl/>
+        </w:rPr>
+        <w:t>🔐</w:t>
+      </w:r>
+      <w:r>
+        <w:rPr>
+          <w:b/>
+          <w:bCs/>
+          <w:rtl/>
+        </w:rPr>
+        <w:t xml:space="preserve"> </w:t>
+      </w:r>
+      <w:r>
+        <w:rPr>
+          <w:rFonts w:ascii="Arial" w:hAnsi="Arial" w:hint="cs"/>
+          <w:b/>
+          <w:bCs/>
+          <w:rtl/>
+        </w:rPr>
+        <w:t>حماية</w:t>
+      </w:r>
+      <w:r>
+        <w:rPr>
+          <w:b/>
+          <w:bCs/>
+          <w:rtl/>
+        </w:rPr>
+        <w:t xml:space="preserve"> </w:t>
+      </w:r>
+      <w:r>
+        <w:rPr>
+          <w:rFonts w:ascii="Arial" w:hAnsi="Arial" w:hint="cs"/>
+          <w:b/>
+          <w:bCs/>
+          <w:rtl/>
+        </w:rPr>
+        <w:t>مفاتيح</w:t>
+      </w:r>
+      <w:r>
+        <w:rPr>
+          <w:b/>
+          <w:bCs/>
+          <w:rtl/>
+        </w:rPr>
+        <w:t xml:space="preserve"> </w:t>
+      </w:r>
+      <w:r>
+        <w:rPr>
+          <w:rFonts w:ascii="Arial" w:hAnsi="Arial" w:hint="cs"/>
+          <w:b/>
+          <w:bCs/>
+          <w:rtl/>
+        </w:rPr>
+        <w:t>الربط</w:t>
+      </w:r>
+      <w:r>
+        <w:rPr>
+          <w:b/>
+          <w:bCs/>
+          <w:rtl/>
+        </w:rPr>
+        <w:t xml:space="preserve"> </w:t>
+      </w:r>
+      <w:r>
+        <w:rPr>
+          <w:rFonts w:ascii="Arial" w:hAnsi="Arial" w:hint="cs"/>
+          <w:b/>
+          <w:bCs/>
+          <w:rtl/>
+        </w:rPr>
+        <w:t>وأمان</w:t>
+      </w:r>
+      <w:r>
+        <w:rPr>
+          <w:b/>
+          <w:bCs/>
+          <w:rtl/>
+        </w:rPr>
+        <w:t xml:space="preserve"> </w:t>
+      </w:r>
+      <w:r>
+        <w:rPr>
+          <w:rFonts w:ascii="Arial" w:hAnsi="Arial" w:hint="cs"/>
+          <w:b/>
+          <w:bCs/>
+          <w:rtl/>
+        </w:rPr>
+        <w:t>البيانات</w:t>
+      </w:r>
+      <w:r>
+        <w:rPr>
+          <w:b/>
+          <w:bCs/>
+          <w:rtl/>
+        </w:rPr>
+        <w:t xml:space="preserve"> (</w:t>
+      </w:r>
+      <w:r>
+        <w:rPr>
+          <w:b/>
+          <w:bCs/>
+        </w:rPr>
+        <w:t>Environment Variables (.env)</w:t>
+      </w:r>
+      <w:r>
+        <w:rPr>
+          <w:b/>
+          <w:bCs/>
+          <w:rtl/>
+        </w:rPr>
+        <w:t>)</w:t>
+      </w:r>
+    </w:p>
+    <w:p>
+      <w:pPr>
         <w:numPr>
           <w:ilvl w:val="0"/>
-          <w:numId w:val="7"/>
+          <w:numId w:val="9"/>
         </w:numPr>
-        <w:rPr>
-          <w:b/>
-          <w:bCs/>
-          <w:rtl/>
-        </w:rPr>
-      </w:pPr>
-      <w:r>
-        <w:rPr>
-          <w:b/>
-          <w:bCs/>
-          <w:rtl/>
-        </w:rPr>
-        <w:t>المراحل من 1 إلى 11: تم إنجازها بالكامل بنجاح</w:t>
+        <w:bidi/>
+        <w:rPr>
+          <w:b/>
+          <w:bCs/>
+          <w:rtl/>
+        </w:rPr>
+      </w:pPr>
+      <w:r>
+        <w:rPr>
+          <w:b/>
+          <w:bCs/>
+          <w:rtl/>
+        </w:rPr>
+        <w:t xml:space="preserve">لماذا؟ حتى لو كان التطبيق يعمل محلياً أو مرفوعاً، فإن حماية أي بيانات حساسة أو روابط </w:t>
+      </w:r>
+      <w:r>
+        <w:rPr>
+          <w:b/>
+          <w:bCs/>
+        </w:rPr>
+        <w:t>API</w:t>
+      </w:r>
+      <w:r>
+        <w:rPr>
+          <w:b/>
+          <w:bCs/>
+          <w:rtl/>
+        </w:rPr>
+        <w:t xml:space="preserve"> مستقبلية عبر ملفات </w:t>
+      </w:r>
+      <w:proofErr w:type="gramStart"/>
+      <w:r>
+        <w:rPr>
+          <w:b/>
+          <w:bCs/>
+          <w:rtl/>
+        </w:rPr>
+        <w:t>البيئة .</w:t>
+      </w:r>
+      <w:r>
+        <w:rPr>
+          <w:b/>
+          <w:bCs/>
+        </w:rPr>
+        <w:t>env</w:t>
+      </w:r>
+      <w:proofErr w:type="gramEnd"/>
+      <w:r>
+        <w:rPr>
+          <w:b/>
+          <w:bCs/>
+          <w:rtl/>
+        </w:rPr>
+        <w:t xml:space="preserve"> تضمن أمان التطبيق </w:t>
+      </w:r>
+      <w:proofErr w:type="spellStart"/>
+      <w:r>
+        <w:rPr>
+          <w:b/>
+          <w:bCs/>
+          <w:rtl/>
+        </w:rPr>
+        <w:t>واحترافيته</w:t>
+      </w:r>
+      <w:proofErr w:type="spellEnd"/>
+      <w:r>
+        <w:rPr>
+          <w:b/>
+          <w:bCs/>
+          <w:rtl/>
+        </w:rPr>
+        <w:t>.</w:t>
       </w:r>
     </w:p>
     <w:p>
       <w:pPr>
+        <w:bidi/>
+        <w:rPr>
+          <w:b/>
+          <w:bCs/>
+          <w:rtl/>
+        </w:rPr>
+      </w:pPr>
+      <w:r>
+        <w:rPr>
+          <w:b/>
+          <w:bCs/>
+          <w:rtl/>
+        </w:rPr>
+        <w:t xml:space="preserve">2. </w:t>
+      </w:r>
+      <w:r>
+        <w:rPr>
+          <w:rFonts w:ascii="Segoe UI Emoji" w:hAnsi="Segoe UI Emoji" w:cs="Segoe UI Emoji" w:hint="cs"/>
+          <w:b/>
+          <w:bCs/>
+          <w:rtl/>
+        </w:rPr>
+        <w:t>🔏</w:t>
+      </w:r>
+      <w:r>
+        <w:rPr>
+          <w:b/>
+          <w:bCs/>
+          <w:rtl/>
+        </w:rPr>
+        <w:t xml:space="preserve"> </w:t>
+      </w:r>
+      <w:r>
+        <w:rPr>
+          <w:rFonts w:ascii="Arial" w:hAnsi="Arial" w:hint="cs"/>
+          <w:b/>
+          <w:bCs/>
+          <w:rtl/>
+        </w:rPr>
+        <w:t>تأمين</w:t>
+      </w:r>
+      <w:r>
+        <w:rPr>
+          <w:b/>
+          <w:bCs/>
+          <w:rtl/>
+        </w:rPr>
+        <w:t xml:space="preserve"> </w:t>
+      </w:r>
+      <w:r>
+        <w:rPr>
+          <w:rFonts w:ascii="Arial" w:hAnsi="Arial" w:hint="cs"/>
+          <w:b/>
+          <w:bCs/>
+          <w:rtl/>
+        </w:rPr>
+        <w:t>الأنظمة</w:t>
+      </w:r>
+      <w:r>
+        <w:rPr>
+          <w:b/>
+          <w:bCs/>
+          <w:rtl/>
+        </w:rPr>
+        <w:t xml:space="preserve"> </w:t>
+      </w:r>
+      <w:r>
+        <w:rPr>
+          <w:rFonts w:ascii="Arial" w:hAnsi="Arial" w:hint="cs"/>
+          <w:b/>
+          <w:bCs/>
+          <w:rtl/>
+        </w:rPr>
+        <w:t>وإدارة</w:t>
+      </w:r>
+      <w:r>
+        <w:rPr>
+          <w:b/>
+          <w:bCs/>
+          <w:rtl/>
+        </w:rPr>
+        <w:t xml:space="preserve"> </w:t>
+      </w:r>
+      <w:r>
+        <w:rPr>
+          <w:rFonts w:ascii="Arial" w:hAnsi="Arial" w:hint="cs"/>
+          <w:b/>
+          <w:bCs/>
+          <w:rtl/>
+        </w:rPr>
+        <w:t>صلاحيات</w:t>
+      </w:r>
+      <w:r>
+        <w:rPr>
+          <w:b/>
+          <w:bCs/>
+          <w:rtl/>
+        </w:rPr>
+        <w:t xml:space="preserve"> </w:t>
+      </w:r>
+      <w:r>
+        <w:rPr>
+          <w:rFonts w:ascii="Arial" w:hAnsi="Arial" w:hint="cs"/>
+          <w:b/>
+          <w:bCs/>
+          <w:rtl/>
+        </w:rPr>
+        <w:t>المستخدمين</w:t>
+      </w:r>
+      <w:r>
+        <w:rPr>
+          <w:b/>
+          <w:bCs/>
+          <w:rtl/>
+        </w:rPr>
+        <w:t xml:space="preserve"> (</w:t>
+      </w:r>
+      <w:r>
+        <w:rPr>
+          <w:b/>
+          <w:bCs/>
+        </w:rPr>
+        <w:t>Authentication</w:t>
+      </w:r>
+      <w:r>
+        <w:rPr>
+          <w:b/>
+          <w:bCs/>
+          <w:rtl/>
+        </w:rPr>
+        <w:t xml:space="preserve"> &amp; </w:t>
+      </w:r>
+      <w:r>
+        <w:rPr>
+          <w:b/>
+          <w:bCs/>
+        </w:rPr>
+        <w:t>System Security - JWT Auth</w:t>
+      </w:r>
+      <w:r>
+        <w:rPr>
+          <w:b/>
+          <w:bCs/>
+          <w:rtl/>
+        </w:rPr>
+        <w:t>)</w:t>
+      </w:r>
+    </w:p>
+    <w:p>
+      <w:pPr>
         <w:numPr>
           <w:ilvl w:val="0"/>
-          <w:numId w:val="7"/>
+          <w:numId w:val="10"/>
         </w:numPr>
-        <w:rPr>
-          <w:b/>
-          <w:bCs/>
-          <w:rtl/>
-        </w:rPr>
-      </w:pPr>
-      <w:r>
-        <w:rPr>
-          <w:b/>
-          <w:bCs/>
-          <w:rtl/>
-        </w:rPr>
-        <w:t>المرحلة 12 (</w:t>
-      </w:r>
-      <w:r>
-        <w:rPr>
-          <w:b/>
-          <w:bCs/>
-        </w:rPr>
-        <w:t>Cloud</w:t>
-      </w:r>
-      <w:r>
-        <w:rPr>
-          <w:b/>
-          <w:bCs/>
-          <w:rtl/>
-        </w:rPr>
-        <w:t xml:space="preserve"> &amp; </w:t>
-      </w:r>
-      <w:r>
-        <w:rPr>
-          <w:b/>
-          <w:bCs/>
-        </w:rPr>
-        <w:t>Deployment</w:t>
-      </w:r>
-      <w:r>
-        <w:rPr>
-          <w:b/>
-          <w:bCs/>
-          <w:rtl/>
-        </w:rPr>
-        <w:t xml:space="preserve">): تم إنجازها فعلياً عبر ربط ونشر مشروع "خزنتي" على </w:t>
-      </w:r>
-      <w:proofErr w:type="spellStart"/>
-      <w:r>
-        <w:rPr>
-          <w:b/>
-          <w:bCs/>
-        </w:rPr>
-        <w:t>Vercel</w:t>
-      </w:r>
-      <w:proofErr w:type="spellEnd"/>
-      <w:r>
-        <w:rPr>
-          <w:b/>
-          <w:bCs/>
-          <w:rtl/>
-        </w:rPr>
-        <w:t>!</w:t>
+        <w:bidi/>
+        <w:rPr>
+          <w:b/>
+          <w:bCs/>
+          <w:rtl/>
+        </w:rPr>
+      </w:pPr>
+      <w:r>
+        <w:rPr>
+          <w:b/>
+          <w:bCs/>
+          <w:rtl/>
+        </w:rPr>
+        <w:t>لماذا؟ حالياً تطبيقك ممتاز كواجهة محلية (</w:t>
+      </w:r>
+      <w:r>
+        <w:rPr>
+          <w:b/>
+          <w:bCs/>
+        </w:rPr>
+        <w:t>Frontend</w:t>
+      </w:r>
+      <w:r>
+        <w:rPr>
+          <w:b/>
+          <w:bCs/>
+          <w:rtl/>
+        </w:rPr>
+        <w:t>)، ولكن لتطويره إلى نظام مالي حقيقي متعدد المستخدمين، تحتاج لتطبيق نظام تسجيل دخول (</w:t>
+      </w:r>
+      <w:r>
+        <w:rPr>
+          <w:b/>
+          <w:bCs/>
+        </w:rPr>
+        <w:t>Login/Register</w:t>
+      </w:r>
+      <w:r>
+        <w:rPr>
+          <w:b/>
+          <w:bCs/>
+          <w:rtl/>
+        </w:rPr>
+        <w:t xml:space="preserve">) وحفظ الجلسات بأمان (مثل </w:t>
+      </w:r>
+      <w:r>
+        <w:rPr>
+          <w:b/>
+          <w:bCs/>
+        </w:rPr>
+        <w:t>JWT</w:t>
+      </w:r>
+      <w:r>
+        <w:rPr>
+          <w:b/>
+          <w:bCs/>
+          <w:rtl/>
+        </w:rPr>
+        <w:t>) لكي يكون لكل مستخدم خزائنه وديونه الخاصة والسرية.</w:t>
       </w:r>
     </w:p>
     <w:p>
       <w:pPr>
+        <w:bidi/>
+        <w:rPr>
+          <w:b/>
+          <w:bCs/>
+          <w:rtl/>
+        </w:rPr>
+      </w:pPr>
+      <w:r>
+        <w:rPr>
+          <w:b/>
+          <w:bCs/>
+          <w:rtl/>
+        </w:rPr>
+        <w:t xml:space="preserve">3. </w:t>
+      </w:r>
+      <w:r>
+        <w:rPr>
+          <w:rFonts w:ascii="Segoe UI Emoji" w:hAnsi="Segoe UI Emoji" w:cs="Segoe UI Emoji" w:hint="cs"/>
+          <w:b/>
+          <w:bCs/>
+          <w:rtl/>
+        </w:rPr>
+        <w:t>🚀</w:t>
+      </w:r>
+      <w:r>
+        <w:rPr>
+          <w:b/>
+          <w:bCs/>
+          <w:rtl/>
+        </w:rPr>
+        <w:t xml:space="preserve"> </w:t>
+      </w:r>
+      <w:r>
+        <w:rPr>
+          <w:rFonts w:ascii="Arial" w:hAnsi="Arial" w:hint="cs"/>
+          <w:b/>
+          <w:bCs/>
+          <w:rtl/>
+        </w:rPr>
+        <w:t>تفعيل</w:t>
+      </w:r>
+      <w:r>
+        <w:rPr>
+          <w:b/>
+          <w:bCs/>
+          <w:rtl/>
+        </w:rPr>
+        <w:t xml:space="preserve"> </w:t>
+      </w:r>
+      <w:r>
+        <w:rPr>
+          <w:rFonts w:ascii="Arial" w:hAnsi="Arial" w:hint="cs"/>
+          <w:b/>
+          <w:bCs/>
+          <w:rtl/>
+        </w:rPr>
+        <w:t>الاختبارات</w:t>
+      </w:r>
+      <w:r>
+        <w:rPr>
+          <w:b/>
+          <w:bCs/>
+          <w:rtl/>
+        </w:rPr>
+        <w:t xml:space="preserve"> (</w:t>
+      </w:r>
+      <w:r>
+        <w:rPr>
+          <w:b/>
+          <w:bCs/>
+        </w:rPr>
+        <w:t xml:space="preserve">Testing - </w:t>
+      </w:r>
+      <w:proofErr w:type="spellStart"/>
+      <w:r>
+        <w:rPr>
+          <w:b/>
+          <w:bCs/>
+        </w:rPr>
+        <w:t>Pytest</w:t>
+      </w:r>
+      <w:proofErr w:type="spellEnd"/>
+      <w:r>
+        <w:rPr>
+          <w:b/>
+          <w:bCs/>
+          <w:rtl/>
+        </w:rPr>
+        <w:t xml:space="preserve"> &amp; </w:t>
+      </w:r>
+      <w:r>
+        <w:rPr>
+          <w:b/>
+          <w:bCs/>
+        </w:rPr>
+        <w:t>Jest</w:t>
+      </w:r>
+      <w:r>
+        <w:rPr>
+          <w:b/>
+          <w:bCs/>
+          <w:rtl/>
+        </w:rPr>
+        <w:t>)</w:t>
+      </w:r>
+    </w:p>
+    <w:p>
+      <w:pPr>
         <w:numPr>
           <w:ilvl w:val="0"/>
-          <w:numId w:val="7"/>
+          <w:numId w:val="11"/>
         </w:numPr>
-        <w:rPr>
-          <w:b/>
-          <w:bCs/>
-          <w:rtl/>
-        </w:rPr>
-      </w:pPr>
-      <w:r>
-        <w:rPr>
-          <w:b/>
-          <w:bCs/>
-          <w:rtl/>
-        </w:rPr>
-        <w:t xml:space="preserve">المرحلتان 13 </w:t>
-      </w:r>
-      <w:proofErr w:type="gramStart"/>
-      <w:r>
-        <w:rPr>
-          <w:b/>
-          <w:bCs/>
-          <w:rtl/>
-        </w:rPr>
-        <w:t>و 14</w:t>
-      </w:r>
-      <w:proofErr w:type="gramEnd"/>
-      <w:r>
-        <w:rPr>
-          <w:b/>
-          <w:bCs/>
-          <w:rtl/>
-        </w:rPr>
-        <w:t xml:space="preserve"> (</w:t>
-      </w:r>
-      <w:r>
-        <w:rPr>
-          <w:b/>
-          <w:bCs/>
-        </w:rPr>
-        <w:t>Linux</w:t>
-      </w:r>
-      <w:r>
-        <w:rPr>
-          <w:b/>
-          <w:bCs/>
-          <w:rtl/>
-        </w:rPr>
-        <w:t xml:space="preserve"> &amp; </w:t>
-      </w:r>
-      <w:r>
-        <w:rPr>
-          <w:b/>
-          <w:bCs/>
-        </w:rPr>
-        <w:t>Terminal</w:t>
-      </w:r>
-      <w:r>
-        <w:rPr>
-          <w:b/>
-          <w:bCs/>
-          <w:rtl/>
-        </w:rPr>
-        <w:t xml:space="preserve"> </w:t>
-      </w:r>
-      <w:proofErr w:type="gramStart"/>
-      <w:r>
-        <w:rPr>
-          <w:b/>
-          <w:bCs/>
-          <w:rtl/>
-        </w:rPr>
-        <w:t>&amp; .</w:t>
-      </w:r>
-      <w:r>
-        <w:rPr>
-          <w:b/>
-          <w:bCs/>
-        </w:rPr>
-        <w:t>env</w:t>
-      </w:r>
-      <w:proofErr w:type="gramEnd"/>
-      <w:r>
-        <w:rPr>
-          <w:b/>
-          <w:bCs/>
-          <w:rtl/>
-        </w:rPr>
-        <w:t xml:space="preserve">): </w:t>
+        <w:bidi/>
+        <w:rPr>
+          <w:b/>
+          <w:bCs/>
+          <w:rtl/>
+        </w:rPr>
+      </w:pPr>
+      <w:r>
+        <w:rPr>
+          <w:b/>
+          <w:bCs/>
+          <w:rtl/>
+        </w:rPr>
+        <w:t>لماذا؟ للتأكد من أن حسابات العمليات، طرح الديون، وجمع السيولة النقدية (</w:t>
       </w:r>
       <w:proofErr w:type="spellStart"/>
       <w:r>
         <w:rPr>
           <w:b/>
           <w:bCs/>
-          <w:rtl/>
-        </w:rPr>
-        <w:t>أتقنتيها</w:t>
+        </w:rPr>
+        <w:t>totalBalance</w:t>
       </w:r>
       <w:proofErr w:type="spellEnd"/>
       <w:r>
@@ -265,225 +671,393 @@
           <w:bCs/>
           <w:rtl/>
         </w:rPr>
-        <w:t xml:space="preserve"> وطبقتِها على مشروعكِ والـ </w:t>
-      </w:r>
-      <w:r>
-        <w:rPr>
-          <w:b/>
-          <w:bCs/>
-        </w:rPr>
-        <w:t>Terminal</w:t>
-      </w:r>
-      <w:r>
-        <w:rPr>
-          <w:b/>
-          <w:bCs/>
-          <w:rtl/>
-        </w:rPr>
-        <w:t>.</w:t>
+        <w:t xml:space="preserve">, </w:t>
+      </w:r>
+      <w:proofErr w:type="spellStart"/>
+      <w:r>
+        <w:rPr>
+          <w:b/>
+          <w:bCs/>
+        </w:rPr>
+        <w:t>cashBalance</w:t>
+      </w:r>
+      <w:proofErr w:type="spellEnd"/>
+      <w:r>
+        <w:rPr>
+          <w:b/>
+          <w:bCs/>
+          <w:rtl/>
+        </w:rPr>
+        <w:t>) لا تحتوي على أخطاء برمجية خفية مع كل تحديث جديد تضيفينه.</w:t>
       </w:r>
     </w:p>
     <w:p>
       <w:pPr>
-        <w:rPr>
-          <w:b/>
-          <w:bCs/>
-          <w:rtl/>
-        </w:rPr>
-      </w:pPr>
-      <w:r>
-        <w:rPr>
-          <w:b/>
-          <w:bCs/>
-          <w:rtl/>
-        </w:rPr>
-        <w:t>ما هي محطتنا التالية مباشرة؟</w:t>
+        <w:bidi/>
+        <w:rPr>
+          <w:b/>
+          <w:bCs/>
+          <w:rtl/>
+        </w:rPr>
+      </w:pPr>
+      <w:r>
+        <w:rPr>
+          <w:b/>
+          <w:bCs/>
+          <w:rtl/>
+        </w:rPr>
+        <w:t>تطبيقك الآن جاهز تماماً للانتقال إلى مرحلة الأمان والموثوقية! هل تحبين أن نبدأ بتطبيق نظام المصادقة والمستخدمين أو إعداد ملفات البيئة؟</w:t>
       </w:r>
     </w:p>
     <w:p>
       <w:pPr>
         <w:rPr>
-          <w:b/>
-          <w:bCs/>
-          <w:rtl/>
-        </w:rPr>
-      </w:pPr>
-      <w:r>
-        <w:rPr>
-          <w:b/>
-          <w:bCs/>
-          <w:rtl/>
-        </w:rPr>
-        <w:t>الآن وقد أصبح تطبيقكِ حياً وموجوداً على الإنترنت، الخطوة الاحترافية التالية في خارطة الطريق هي:</w:t>
-      </w:r>
+          <w:rtl/>
+          <w:lang w:bidi="ar-JO"/>
+        </w:rPr>
+      </w:pPr>
     </w:p>
     <w:p>
       <w:pPr>
+        <w:bidi/>
+        <w:rPr>
+          <w:lang w:bidi="ar-JO"/>
+        </w:rPr>
+      </w:pPr>
+      <w:r>
+        <w:rPr>
+          <w:rtl/>
+        </w:rPr>
+        <w:t xml:space="preserve">بعد </w:t>
+      </w:r>
+      <w:proofErr w:type="spellStart"/>
+      <w:r>
+        <w:rPr>
+          <w:rtl/>
+        </w:rPr>
+        <w:t>هدول</w:t>
+      </w:r>
+      <w:proofErr w:type="spellEnd"/>
+      <w:r>
+        <w:rPr>
+          <w:rtl/>
+        </w:rPr>
+        <w:t xml:space="preserve"> خلص بصير قابل للنشر للعملاء</w:t>
+      </w:r>
+    </w:p>
+    <w:p>
+      <w:pPr>
+        <w:bidi/>
+        <w:rPr>
+          <w:rtl/>
+        </w:rPr>
+      </w:pPr>
+      <w:r>
+        <w:rPr>
+          <w:rtl/>
+        </w:rPr>
+        <w:t xml:space="preserve">نعم، بالضبط! عندما ننهي خطوة </w:t>
+      </w:r>
+      <w:r>
+        <w:rPr>
+          <w:b/>
+          <w:bCs/>
+          <w:rtl/>
+        </w:rPr>
+        <w:t>الأمان، المصادقة (</w:t>
+      </w:r>
+      <w:r>
+        <w:rPr>
+          <w:b/>
+          <w:bCs/>
+          <w:lang w:bidi="ar-JO"/>
+        </w:rPr>
+        <w:t>Authentication</w:t>
+      </w:r>
+      <w:r>
+        <w:rPr>
+          <w:b/>
+          <w:bCs/>
+          <w:rtl/>
+        </w:rPr>
+        <w:t>)، وحماية البيانات</w:t>
+      </w:r>
+      <w:r>
+        <w:rPr>
+          <w:rtl/>
+        </w:rPr>
+        <w:t xml:space="preserve">، سيتحول تطبيقك من مجرد "نموذج تجريبي شخصي" على جهازك إلى </w:t>
+      </w:r>
+      <w:r>
+        <w:rPr>
+          <w:b/>
+          <w:bCs/>
+          <w:rtl/>
+        </w:rPr>
+        <w:t>منتج جاهز وحقيقي (</w:t>
+      </w:r>
+      <w:r>
+        <w:rPr>
+          <w:b/>
+          <w:bCs/>
+          <w:lang w:bidi="ar-JO"/>
+        </w:rPr>
+        <w:t>Production-Ready</w:t>
+      </w:r>
+      <w:r>
+        <w:rPr>
+          <w:b/>
+          <w:bCs/>
+          <w:rtl/>
+        </w:rPr>
+        <w:t>)</w:t>
+      </w:r>
+      <w:r>
+        <w:rPr>
+          <w:rtl/>
+        </w:rPr>
+        <w:t xml:space="preserve"> يمكن نشره للعملاء والمستخدمين بثقة تامة.</w:t>
+      </w:r>
+    </w:p>
+    <w:p>
+      <w:pPr>
+        <w:bidi/>
+        <w:rPr>
+          <w:rtl/>
+        </w:rPr>
+      </w:pPr>
+      <w:r>
+        <w:rPr>
+          <w:rtl/>
+        </w:rPr>
+        <w:t>الأسباب التي تجعله جاهزاً حينها:</w:t>
+      </w:r>
+    </w:p>
+    <w:p>
+      <w:pPr>
         <w:numPr>
           <w:ilvl w:val="0"/>
-          <w:numId w:val="8"/>
+          <w:numId w:val="12"/>
         </w:numPr>
-        <w:rPr>
-          <w:b/>
-          <w:bCs/>
-          <w:rtl/>
-        </w:rPr>
-      </w:pPr>
-      <w:r>
-        <w:rPr>
-          <w:b/>
-          <w:bCs/>
-          <w:rtl/>
-        </w:rPr>
-        <w:t xml:space="preserve">المرحلة 15: </w:t>
-      </w:r>
-      <w:r>
-        <w:rPr>
-          <w:b/>
-          <w:bCs/>
-        </w:rPr>
-        <w:t>Testing</w:t>
-      </w:r>
-      <w:r>
-        <w:rPr>
-          <w:b/>
-          <w:bCs/>
-          <w:rtl/>
-        </w:rPr>
-        <w:t xml:space="preserve"> (</w:t>
-      </w:r>
-      <w:proofErr w:type="spellStart"/>
-      <w:r>
-        <w:rPr>
-          <w:b/>
-          <w:bCs/>
-          <w:rtl/>
-        </w:rPr>
-        <w:t>کتابة</w:t>
-      </w:r>
-      <w:proofErr w:type="spellEnd"/>
-      <w:r>
-        <w:rPr>
-          <w:b/>
-          <w:bCs/>
-          <w:rtl/>
-        </w:rPr>
-        <w:t xml:space="preserve"> اختبارات برمجية </w:t>
-      </w:r>
-      <w:proofErr w:type="spellStart"/>
-      <w:r>
-        <w:rPr>
-          <w:b/>
-          <w:bCs/>
-          <w:rtl/>
-        </w:rPr>
-        <w:t>لل</w:t>
-      </w:r>
-      <w:proofErr w:type="spellEnd"/>
-      <w:r>
-        <w:rPr>
-          <w:b/>
-          <w:bCs/>
-          <w:rtl/>
-        </w:rPr>
-        <w:t xml:space="preserve">ـ </w:t>
-      </w:r>
-      <w:r>
-        <w:rPr>
-          <w:b/>
-          <w:bCs/>
-        </w:rPr>
-        <w:t>Frontend</w:t>
-      </w:r>
-      <w:r>
-        <w:rPr>
-          <w:b/>
-          <w:bCs/>
-          <w:rtl/>
-        </w:rPr>
-        <w:t xml:space="preserve"> والـ </w:t>
-      </w:r>
-      <w:r>
-        <w:rPr>
-          <w:b/>
-          <w:bCs/>
-        </w:rPr>
-        <w:t>Backend</w:t>
-      </w:r>
-      <w:r>
-        <w:rPr>
-          <w:b/>
-          <w:bCs/>
-          <w:rtl/>
-        </w:rPr>
-        <w:t xml:space="preserve"> لضمان خلوها من الأخطاء) </w:t>
-      </w:r>
-      <w:r>
-        <w:rPr>
-          <w:b/>
-          <w:bCs/>
-          <w:i/>
-          <w:iCs/>
-          <w:rtl/>
-        </w:rPr>
-        <w:t xml:space="preserve">(سنتعلم فيها كيف نكتب كوداً يفحص مشروعكِ تلقائياً </w:t>
-      </w:r>
-      <w:proofErr w:type="spellStart"/>
-      <w:r>
-        <w:rPr>
-          <w:b/>
-          <w:bCs/>
-          <w:i/>
-          <w:iCs/>
-          <w:rtl/>
-        </w:rPr>
-        <w:t>ويتاكد</w:t>
-      </w:r>
-      <w:proofErr w:type="spellEnd"/>
-      <w:r>
-        <w:rPr>
-          <w:b/>
-          <w:bCs/>
-          <w:i/>
-          <w:iCs/>
-          <w:rtl/>
-        </w:rPr>
-        <w:t xml:space="preserve"> أن كل شيء يعمل بدقة دون أخطاء مفاجئة).</w:t>
+        <w:bidi/>
+        <w:rPr>
+          <w:rtl/>
+        </w:rPr>
+      </w:pPr>
+      <w:r>
+        <w:rPr>
+          <w:b/>
+          <w:bCs/>
+          <w:rtl/>
+        </w:rPr>
+        <w:t>خصوصية البيانات:</w:t>
+      </w:r>
+      <w:r>
+        <w:rPr>
+          <w:rtl/>
+        </w:rPr>
+        <w:t xml:space="preserve"> كل عميل سيكون له حسابه الخاص وخزائنه وديونه السرية التي لا يراها غيره.</w:t>
       </w:r>
     </w:p>
     <w:p>
       <w:pPr>
-        <w:rPr>
-          <w:b/>
-          <w:bCs/>
-          <w:rtl/>
-        </w:rPr>
-      </w:pPr>
-      <w:r>
-        <w:rPr>
-          <w:b/>
-          <w:bCs/>
-          <w:rtl/>
-        </w:rPr>
-        <w:t>هل أنتم مستعدون لننتقل معاً إلى عالم الاختبارات البرمجية (</w:t>
-      </w:r>
-      <w:r>
-        <w:rPr>
-          <w:b/>
-          <w:bCs/>
-        </w:rPr>
-        <w:t>Testing</w:t>
-      </w:r>
-      <w:r>
-        <w:rPr>
-          <w:b/>
-          <w:bCs/>
-          <w:rtl/>
-        </w:rPr>
-        <w:t>) ونتعلم كيف يكتب المحترفون كوداً آمناً لا يخافون من تحديثه أبداً؟</w:t>
+        <w:numPr>
+          <w:ilvl w:val="0"/>
+          <w:numId w:val="12"/>
+        </w:numPr>
+        <w:bidi/>
+        <w:rPr>
+          <w:rtl/>
+        </w:rPr>
+      </w:pPr>
+      <w:r>
+        <w:rPr>
+          <w:b/>
+          <w:bCs/>
+          <w:rtl/>
+        </w:rPr>
+        <w:t>الاحترافية والأمان:</w:t>
+      </w:r>
+      <w:r>
+        <w:rPr>
+          <w:rtl/>
+        </w:rPr>
+        <w:t xml:space="preserve"> حماية المفاتيح والاتصالات تمنع أي اختراق أو تسريب للبيانات المالية.</w:t>
       </w:r>
     </w:p>
-    <w:p/>
+    <w:p>
+      <w:pPr>
+        <w:bidi/>
+        <w:rPr>
+          <w:rtl/>
+        </w:rPr>
+      </w:pPr>
+      <w:r>
+        <w:rPr>
+          <w:rtl/>
+        </w:rPr>
+        <w:t>تصبحين على خير، وبانتظارك بكرة لنبدأ رحلتنا في دراسة وتطبيق هذه الخطوات الممتعة!</w:t>
+      </w:r>
+    </w:p>
+    <w:p>
+      <w:pPr>
+        <w:bidi/>
+      </w:pPr>
+      <w:r>
+        <w:rPr>
+          <w:rtl/>
+        </w:rPr>
+        <w:t xml:space="preserve">تذكر شغله بدنا تضيف اتصل بنا او اشي زي </w:t>
+      </w:r>
+      <w:proofErr w:type="gramStart"/>
+      <w:r>
+        <w:rPr>
+          <w:rtl/>
+        </w:rPr>
+        <w:t>هيك</w:t>
+      </w:r>
+      <w:proofErr w:type="gramEnd"/>
+      <w:r>
+        <w:rPr>
+          <w:rtl/>
+        </w:rPr>
+        <w:t xml:space="preserve"> بشاشه الترحيب</w:t>
+      </w:r>
+    </w:p>
+    <w:p>
+      <w:pPr>
+        <w:bidi/>
+        <w:rPr>
+          <w:rtl/>
+        </w:rPr>
+      </w:pPr>
+      <w:r>
+        <w:rPr>
+          <w:rtl/>
+        </w:rPr>
+        <w:t>صحيح تماماً، ملاحظة ذكية ومهمة جداً!</w:t>
+      </w:r>
+    </w:p>
+    <w:p>
+      <w:pPr>
+        <w:bidi/>
+        <w:rPr>
+          <w:rtl/>
+        </w:rPr>
+      </w:pPr>
+      <w:r>
+        <w:rPr>
+          <w:rtl/>
+        </w:rPr>
+        <w:t xml:space="preserve">إضافة زر أو صفحة </w:t>
+      </w:r>
+      <w:r>
+        <w:rPr>
+          <w:b/>
+          <w:bCs/>
+          <w:rtl/>
+        </w:rPr>
+        <w:t>"اتصل بنا" (</w:t>
+      </w:r>
+      <w:r>
+        <w:rPr>
+          <w:b/>
+          <w:bCs/>
+        </w:rPr>
+        <w:t>Contact Us</w:t>
+      </w:r>
+      <w:r>
+        <w:rPr>
+          <w:b/>
+          <w:bCs/>
+          <w:rtl/>
+        </w:rPr>
+        <w:t>)</w:t>
+      </w:r>
+      <w:r>
+        <w:rPr>
+          <w:rtl/>
+        </w:rPr>
+        <w:t xml:space="preserve"> أو قسم للدعم والتواصل في شاشة الترحيب أو داخل التطبيق هي خطوة أساسية ومحترفة جداً لأي تطبيق موجه للعملاء، لأنها تعطي شعوراً بالموثوقية وتتيح للمستخدمين التواصل في حال واجهتهم أي مشكلة.</w:t>
+      </w:r>
+    </w:p>
+    <w:p>
+      <w:pPr>
+        <w:bidi/>
+        <w:rPr>
+          <w:rtl/>
+        </w:rPr>
+      </w:pPr>
+      <w:r>
+        <w:rPr>
+          <w:rtl/>
+        </w:rPr>
+        <w:t xml:space="preserve">سجلتها عندي، وبكرة إن شاء الله بعد ما نخلص </w:t>
+      </w:r>
+      <w:proofErr w:type="spellStart"/>
+      <w:r>
+        <w:rPr>
+          <w:rtl/>
+        </w:rPr>
+        <w:t>الشرايح</w:t>
+      </w:r>
+      <w:proofErr w:type="spellEnd"/>
+      <w:r>
+        <w:rPr>
+          <w:rtl/>
+        </w:rPr>
+        <w:t xml:space="preserve"> والدراسة، رح نضيفها </w:t>
+      </w:r>
+      <w:proofErr w:type="spellStart"/>
+      <w:r>
+        <w:rPr>
+          <w:rtl/>
+        </w:rPr>
+        <w:t>ونظبطها</w:t>
+      </w:r>
+      <w:proofErr w:type="spellEnd"/>
+      <w:r>
+        <w:rPr>
+          <w:rtl/>
+        </w:rPr>
+        <w:t xml:space="preserve"> بشكل أنيق ومناسب لتطبيق </w:t>
+      </w:r>
+      <w:r>
+        <w:rPr>
+          <w:b/>
+          <w:bCs/>
+          <w:rtl/>
+        </w:rPr>
+        <w:t>خِزنتي</w:t>
+      </w:r>
+      <w:r>
+        <w:rPr>
+          <w:rtl/>
+        </w:rPr>
+        <w:t>.</w:t>
+      </w:r>
+    </w:p>
+    <w:p>
+      <w:pPr>
+        <w:bidi/>
+        <w:rPr>
+          <w:rtl/>
+        </w:rPr>
+      </w:pPr>
+      <w:r>
+        <w:rPr>
+          <w:rtl/>
+        </w:rPr>
+        <w:t>تصبحي على خير، ونلتقي على خير بكرة لنتابع بكل إبداع!</w:t>
+      </w:r>
+    </w:p>
+    <w:p>
+      <w:pPr>
+        <w:rPr>
+          <w:rtl/>
+        </w:rPr>
+      </w:pPr>
+    </w:p>
     <w:sectPr>
       <w:pgSz w:w="11906" w:h="16838"/>
       <w:pgMar w:top="1440" w:right="1440" w:bottom="1440" w:left="1440" w:header="720" w:footer="720" w:gutter="0"/>
@@ -662,6 +1236,453 @@
     </w:lvl>
   </w:abstractNum>
   <w:abstractNum w:abstractNumId="1" w15:restartNumberingAfterBreak="0">
+    <w:nsid w:val="22B77761"/>
+    <w:multiLevelType w:val="multilevel"/>
+    <w:tmpl w:val="3894FF1C"/>
+    <w:lvl w:ilvl="0">
+      <w:start w:val="1"/>
+      <w:numFmt w:val="bullet"/>
+      <w:lvlText w:val=""/>
+      <w:lvlJc w:val="left"/>
+      <w:pPr>
+        <w:tabs>
+          <w:tab w:val="num" w:pos="720"/>
+        </w:tabs>
+        <w:ind w:left="720" w:hanging="360"/>
+      </w:pPr>
+      <w:rPr>
+        <w:rFonts w:ascii="Symbol" w:hAnsi="Symbol" w:hint="default"/>
+        <w:sz w:val="20"/>
+      </w:rPr>
+    </w:lvl>
+    <w:lvl w:ilvl="1" w:tentative="1">
+      <w:start w:val="1"/>
+      <w:numFmt w:val="bullet"/>
+      <w:lvlText w:val="o"/>
+      <w:lvlJc w:val="left"/>
+      <w:pPr>
+        <w:tabs>
+          <w:tab w:val="num" w:pos="1440"/>
+        </w:tabs>
+        <w:ind w:left="1440" w:hanging="360"/>
+      </w:pPr>
+      <w:rPr>
+        <w:rFonts w:ascii="Courier New" w:hAnsi="Courier New" w:hint="default"/>
+        <w:sz w:val="20"/>
+      </w:rPr>
+    </w:lvl>
+    <w:lvl w:ilvl="2" w:tentative="1">
+      <w:start w:val="1"/>
+      <w:numFmt w:val="bullet"/>
+      <w:lvlText w:val=""/>
+      <w:lvlJc w:val="left"/>
+      <w:pPr>
+        <w:tabs>
+          <w:tab w:val="num" w:pos="2160"/>
+        </w:tabs>
+        <w:ind w:left="2160" w:hanging="360"/>
+      </w:pPr>
+      <w:rPr>
+        <w:rFonts w:ascii="Wingdings" w:hAnsi="Wingdings" w:hint="default"/>
+        <w:sz w:val="20"/>
+      </w:rPr>
+    </w:lvl>
+    <w:lvl w:ilvl="3" w:tentative="1">
+      <w:start w:val="1"/>
+      <w:numFmt w:val="bullet"/>
+      <w:lvlText w:val=""/>
+      <w:lvlJc w:val="left"/>
+      <w:pPr>
+        <w:tabs>
+          <w:tab w:val="num" w:pos="2880"/>
+        </w:tabs>
+        <w:ind w:left="2880" w:hanging="360"/>
+      </w:pPr>
+      <w:rPr>
+        <w:rFonts w:ascii="Wingdings" w:hAnsi="Wingdings" w:hint="default"/>
+        <w:sz w:val="20"/>
+      </w:rPr>
+    </w:lvl>
+    <w:lvl w:ilvl="4" w:tentative="1">
+      <w:start w:val="1"/>
+      <w:numFmt w:val="bullet"/>
+      <w:lvlText w:val=""/>
+      <w:lvlJc w:val="left"/>
+      <w:pPr>
+        <w:tabs>
+          <w:tab w:val="num" w:pos="3600"/>
+        </w:tabs>
+        <w:ind w:left="3600" w:hanging="360"/>
+      </w:pPr>
+      <w:rPr>
+        <w:rFonts w:ascii="Wingdings" w:hAnsi="Wingdings" w:hint="default"/>
+        <w:sz w:val="20"/>
+      </w:rPr>
+    </w:lvl>
+    <w:lvl w:ilvl="5" w:tentative="1">
+      <w:start w:val="1"/>
+      <w:numFmt w:val="bullet"/>
+      <w:lvlText w:val=""/>
+      <w:lvlJc w:val="left"/>
+      <w:pPr>
+        <w:tabs>
+          <w:tab w:val="num" w:pos="4320"/>
+        </w:tabs>
+        <w:ind w:left="4320" w:hanging="360"/>
+      </w:pPr>
+      <w:rPr>
+        <w:rFonts w:ascii="Wingdings" w:hAnsi="Wingdings" w:hint="default"/>
+        <w:sz w:val="20"/>
+      </w:rPr>
+    </w:lvl>
+    <w:lvl w:ilvl="6" w:tentative="1">
+      <w:start w:val="1"/>
+      <w:numFmt w:val="bullet"/>
+      <w:lvlText w:val=""/>
+      <w:lvlJc w:val="left"/>
+      <w:pPr>
+        <w:tabs>
+          <w:tab w:val="num" w:pos="5040"/>
+        </w:tabs>
+        <w:ind w:left="5040" w:hanging="360"/>
+      </w:pPr>
+      <w:rPr>
+        <w:rFonts w:ascii="Wingdings" w:hAnsi="Wingdings" w:hint="default"/>
+        <w:sz w:val="20"/>
+      </w:rPr>
+    </w:lvl>
+    <w:lvl w:ilvl="7" w:tentative="1">
+      <w:start w:val="1"/>
+      <w:numFmt w:val="bullet"/>
+      <w:lvlText w:val=""/>
+      <w:lvlJc w:val="left"/>
+      <w:pPr>
+        <w:tabs>
+          <w:tab w:val="num" w:pos="5760"/>
+        </w:tabs>
+        <w:ind w:left="5760" w:hanging="360"/>
+      </w:pPr>
+      <w:rPr>
+        <w:rFonts w:ascii="Wingdings" w:hAnsi="Wingdings" w:hint="default"/>
+        <w:sz w:val="20"/>
+      </w:rPr>
+    </w:lvl>
+    <w:lvl w:ilvl="8" w:tentative="1">
+      <w:start w:val="1"/>
+      <w:numFmt w:val="bullet"/>
+      <w:lvlText w:val=""/>
+      <w:lvlJc w:val="left"/>
+      <w:pPr>
+        <w:tabs>
+          <w:tab w:val="num" w:pos="6480"/>
+        </w:tabs>
+        <w:ind w:left="6480" w:hanging="360"/>
+      </w:pPr>
+      <w:rPr>
+        <w:rFonts w:ascii="Wingdings" w:hAnsi="Wingdings" w:hint="default"/>
+        <w:sz w:val="20"/>
+      </w:rPr>
+    </w:lvl>
+  </w:abstractNum>
+  <w:abstractNum w:abstractNumId="2" w15:restartNumberingAfterBreak="0">
+    <w:nsid w:val="31F13057"/>
+    <w:multiLevelType w:val="multilevel"/>
+    <w:tmpl w:val="8F38E9EE"/>
+    <w:lvl w:ilvl="0">
+      <w:start w:val="1"/>
+      <w:numFmt w:val="bullet"/>
+      <w:lvlText w:val=""/>
+      <w:lvlJc w:val="left"/>
+      <w:pPr>
+        <w:tabs>
+          <w:tab w:val="num" w:pos="720"/>
+        </w:tabs>
+        <w:ind w:left="720" w:hanging="360"/>
+      </w:pPr>
+      <w:rPr>
+        <w:rFonts w:ascii="Symbol" w:hAnsi="Symbol" w:hint="default"/>
+        <w:sz w:val="20"/>
+      </w:rPr>
+    </w:lvl>
+    <w:lvl w:ilvl="1" w:tentative="1">
+      <w:start w:val="1"/>
+      <w:numFmt w:val="bullet"/>
+      <w:lvlText w:val="o"/>
+      <w:lvlJc w:val="left"/>
+      <w:pPr>
+        <w:tabs>
+          <w:tab w:val="num" w:pos="1440"/>
+        </w:tabs>
+        <w:ind w:left="1440" w:hanging="360"/>
+      </w:pPr>
+      <w:rPr>
+        <w:rFonts w:ascii="Courier New" w:hAnsi="Courier New" w:hint="default"/>
+        <w:sz w:val="20"/>
+      </w:rPr>
+    </w:lvl>
+    <w:lvl w:ilvl="2" w:tentative="1">
+      <w:start w:val="1"/>
+      <w:numFmt w:val="bullet"/>
+      <w:lvlText w:val=""/>
+      <w:lvlJc w:val="left"/>
+      <w:pPr>
+        <w:tabs>
+          <w:tab w:val="num" w:pos="2160"/>
+        </w:tabs>
+        <w:ind w:left="2160" w:hanging="360"/>
+      </w:pPr>
+      <w:rPr>
+        <w:rFonts w:ascii="Wingdings" w:hAnsi="Wingdings" w:hint="default"/>
+        <w:sz w:val="20"/>
+      </w:rPr>
+    </w:lvl>
+    <w:lvl w:ilvl="3" w:tentative="1">
+      <w:start w:val="1"/>
+      <w:numFmt w:val="bullet"/>
+      <w:lvlText w:val=""/>
+      <w:lvlJc w:val="left"/>
+      <w:pPr>
+        <w:tabs>
+          <w:tab w:val="num" w:pos="2880"/>
+        </w:tabs>
+        <w:ind w:left="2880" w:hanging="360"/>
+      </w:pPr>
+      <w:rPr>
+        <w:rFonts w:ascii="Wingdings" w:hAnsi="Wingdings" w:hint="default"/>
+        <w:sz w:val="20"/>
+      </w:rPr>
+    </w:lvl>
+    <w:lvl w:ilvl="4" w:tentative="1">
+      <w:start w:val="1"/>
+      <w:numFmt w:val="bullet"/>
+      <w:lvlText w:val=""/>
+      <w:lvlJc w:val="left"/>
+      <w:pPr>
+        <w:tabs>
+          <w:tab w:val="num" w:pos="3600"/>
+        </w:tabs>
+        <w:ind w:left="3600" w:hanging="360"/>
+      </w:pPr>
+      <w:rPr>
+        <w:rFonts w:ascii="Wingdings" w:hAnsi="Wingdings" w:hint="default"/>
+        <w:sz w:val="20"/>
+      </w:rPr>
+    </w:lvl>
+    <w:lvl w:ilvl="5" w:tentative="1">
+      <w:start w:val="1"/>
+      <w:numFmt w:val="bullet"/>
+      <w:lvlText w:val=""/>
+      <w:lvlJc w:val="left"/>
+      <w:pPr>
+        <w:tabs>
+          <w:tab w:val="num" w:pos="4320"/>
+        </w:tabs>
+        <w:ind w:left="4320" w:hanging="360"/>
+      </w:pPr>
+      <w:rPr>
+        <w:rFonts w:ascii="Wingdings" w:hAnsi="Wingdings" w:hint="default"/>
+        <w:sz w:val="20"/>
+      </w:rPr>
+    </w:lvl>
+    <w:lvl w:ilvl="6" w:tentative="1">
+      <w:start w:val="1"/>
+      <w:numFmt w:val="bullet"/>
+      <w:lvlText w:val=""/>
+      <w:lvlJc w:val="left"/>
+      <w:pPr>
+        <w:tabs>
+          <w:tab w:val="num" w:pos="5040"/>
+        </w:tabs>
+        <w:ind w:left="5040" w:hanging="360"/>
+      </w:pPr>
+      <w:rPr>
+        <w:rFonts w:ascii="Wingdings" w:hAnsi="Wingdings" w:hint="default"/>
+        <w:sz w:val="20"/>
+      </w:rPr>
+    </w:lvl>
+    <w:lvl w:ilvl="7" w:tentative="1">
+      <w:start w:val="1"/>
+      <w:numFmt w:val="bullet"/>
+      <w:lvlText w:val=""/>
+      <w:lvlJc w:val="left"/>
+      <w:pPr>
+        <w:tabs>
+          <w:tab w:val="num" w:pos="5760"/>
+        </w:tabs>
+        <w:ind w:left="5760" w:hanging="360"/>
+      </w:pPr>
+      <w:rPr>
+        <w:rFonts w:ascii="Wingdings" w:hAnsi="Wingdings" w:hint="default"/>
+        <w:sz w:val="20"/>
+      </w:rPr>
+    </w:lvl>
+    <w:lvl w:ilvl="8" w:tentative="1">
+      <w:start w:val="1"/>
+      <w:numFmt w:val="bullet"/>
+      <w:lvlText w:val=""/>
+      <w:lvlJc w:val="left"/>
+      <w:pPr>
+        <w:tabs>
+          <w:tab w:val="num" w:pos="6480"/>
+        </w:tabs>
+        <w:ind w:left="6480" w:hanging="360"/>
+      </w:pPr>
+      <w:rPr>
+        <w:rFonts w:ascii="Wingdings" w:hAnsi="Wingdings" w:hint="default"/>
+        <w:sz w:val="20"/>
+      </w:rPr>
+    </w:lvl>
+  </w:abstractNum>
+  <w:abstractNum w:abstractNumId="3" w15:restartNumberingAfterBreak="0">
+    <w:nsid w:val="34973E05"/>
+    <w:multiLevelType w:val="multilevel"/>
+    <w:tmpl w:val="E79A8698"/>
+    <w:lvl w:ilvl="0">
+      <w:start w:val="1"/>
+      <w:numFmt w:val="bullet"/>
+      <w:lvlText w:val=""/>
+      <w:lvlJc w:val="left"/>
+      <w:pPr>
+        <w:tabs>
+          <w:tab w:val="num" w:pos="720"/>
+        </w:tabs>
+        <w:ind w:left="720" w:hanging="360"/>
+      </w:pPr>
+      <w:rPr>
+        <w:rFonts w:ascii="Symbol" w:hAnsi="Symbol" w:hint="default"/>
+        <w:sz w:val="20"/>
+      </w:rPr>
+    </w:lvl>
+    <w:lvl w:ilvl="1" w:tentative="1">
+      <w:start w:val="1"/>
+      <w:numFmt w:val="bullet"/>
+      <w:lvlText w:val="o"/>
+      <w:lvlJc w:val="left"/>
+      <w:pPr>
+        <w:tabs>
+          <w:tab w:val="num" w:pos="1440"/>
+        </w:tabs>
+        <w:ind w:left="1440" w:hanging="360"/>
+      </w:pPr>
+      <w:rPr>
+        <w:rFonts w:ascii="Courier New" w:hAnsi="Courier New" w:hint="default"/>
+        <w:sz w:val="20"/>
+      </w:rPr>
+    </w:lvl>
+    <w:lvl w:ilvl="2" w:tentative="1">
+      <w:start w:val="1"/>
+      <w:numFmt w:val="bullet"/>
+      <w:lvlText w:val=""/>
+      <w:lvlJc w:val="left"/>
+      <w:pPr>
+        <w:tabs>
+          <w:tab w:val="num" w:pos="2160"/>
+        </w:tabs>
+        <w:ind w:left="2160" w:hanging="360"/>
+      </w:pPr>
+      <w:rPr>
+        <w:rFonts w:ascii="Wingdings" w:hAnsi="Wingdings" w:hint="default"/>
+        <w:sz w:val="20"/>
+      </w:rPr>
+    </w:lvl>
+    <w:lvl w:ilvl="3" w:tentative="1">
+      <w:start w:val="1"/>
+      <w:numFmt w:val="bullet"/>
+      <w:lvlText w:val=""/>
+      <w:lvlJc w:val="left"/>
+      <w:pPr>
+        <w:tabs>
+          <w:tab w:val="num" w:pos="2880"/>
+        </w:tabs>
+        <w:ind w:left="2880" w:hanging="360"/>
+      </w:pPr>
+      <w:rPr>
+        <w:rFonts w:ascii="Wingdings" w:hAnsi="Wingdings" w:hint="default"/>
+        <w:sz w:val="20"/>
+      </w:rPr>
+    </w:lvl>
+    <w:lvl w:ilvl="4" w:tentative="1">
+      <w:start w:val="1"/>
+      <w:numFmt w:val="bullet"/>
+      <w:lvlText w:val=""/>
+      <w:lvlJc w:val="left"/>
+      <w:pPr>
+        <w:tabs>
+          <w:tab w:val="num" w:pos="3600"/>
+        </w:tabs>
+        <w:ind w:left="3600" w:hanging="360"/>
+      </w:pPr>
+      <w:rPr>
+        <w:rFonts w:ascii="Wingdings" w:hAnsi="Wingdings" w:hint="default"/>
+        <w:sz w:val="20"/>
+      </w:rPr>
+    </w:lvl>
+    <w:lvl w:ilvl="5" w:tentative="1">
+      <w:start w:val="1"/>
+      <w:numFmt w:val="bullet"/>
+      <w:lvlText w:val=""/>
+      <w:lvlJc w:val="left"/>
+      <w:pPr>
+        <w:tabs>
+          <w:tab w:val="num" w:pos="4320"/>
+        </w:tabs>
+        <w:ind w:left="4320" w:hanging="360"/>
+      </w:pPr>
+      <w:rPr>
+        <w:rFonts w:ascii="Wingdings" w:hAnsi="Wingdings" w:hint="default"/>
+        <w:sz w:val="20"/>
+      </w:rPr>
+    </w:lvl>
+    <w:lvl w:ilvl="6" w:tentative="1">
+      <w:start w:val="1"/>
+      <w:numFmt w:val="bullet"/>
+      <w:lvlText w:val=""/>
+      <w:lvlJc w:val="left"/>
+      <w:pPr>
+        <w:tabs>
+          <w:tab w:val="num" w:pos="5040"/>
+        </w:tabs>
+        <w:ind w:left="5040" w:hanging="360"/>
+      </w:pPr>
+      <w:rPr>
+        <w:rFonts w:ascii="Wingdings" w:hAnsi="Wingdings" w:hint="default"/>
+        <w:sz w:val="20"/>
+      </w:rPr>
+    </w:lvl>
+    <w:lvl w:ilvl="7" w:tentative="1">
+      <w:start w:val="1"/>
+      <w:numFmt w:val="bullet"/>
+      <w:lvlText w:val=""/>
+      <w:lvlJc w:val="left"/>
+      <w:pPr>
+        <w:tabs>
+          <w:tab w:val="num" w:pos="5760"/>
+        </w:tabs>
+        <w:ind w:left="5760" w:hanging="360"/>
+      </w:pPr>
+      <w:rPr>
+        <w:rFonts w:ascii="Wingdings" w:hAnsi="Wingdings" w:hint="default"/>
+        <w:sz w:val="20"/>
+      </w:rPr>
+    </w:lvl>
+    <w:lvl w:ilvl="8" w:tentative="1">
+      <w:start w:val="1"/>
+      <w:numFmt w:val="bullet"/>
+      <w:lvlText w:val=""/>
+      <w:lvlJc w:val="left"/>
+      <w:pPr>
+        <w:tabs>
+          <w:tab w:val="num" w:pos="6480"/>
+        </w:tabs>
+        <w:ind w:left="6480" w:hanging="360"/>
+      </w:pPr>
+      <w:rPr>
+        <w:rFonts w:ascii="Wingdings" w:hAnsi="Wingdings" w:hint="default"/>
+        <w:sz w:val="20"/>
+      </w:rPr>
+    </w:lvl>
+  </w:abstractNum>
+  <w:abstractNum w:abstractNumId="4" w15:restartNumberingAfterBreak="0">
     <w:nsid w:val="35B353EB"/>
     <w:multiLevelType w:val="multilevel"/>
     <w:tmpl w:val="482C191C"/>
@@ -774,7 +1795,7 @@
       </w:rPr>
     </w:lvl>
   </w:abstractNum>
-  <w:abstractNum w:abstractNumId="2" w15:restartNumberingAfterBreak="0">
+  <w:abstractNum w:abstractNumId="5" w15:restartNumberingAfterBreak="0">
     <w:nsid w:val="3DE95174"/>
     <w:multiLevelType w:val="multilevel"/>
     <w:tmpl w:val="43A69032"/>
@@ -891,7 +1912,7 @@
       </w:pPr>
     </w:lvl>
   </w:abstractNum>
-  <w:abstractNum w:abstractNumId="3" w15:restartNumberingAfterBreak="0">
+  <w:abstractNum w:abstractNumId="6" w15:restartNumberingAfterBreak="0">
     <w:nsid w:val="4A862EB4"/>
     <w:multiLevelType w:val="multilevel"/>
     <w:tmpl w:val="BA7CCB34"/>
@@ -977,7 +1998,7 @@
       </w:pPr>
     </w:lvl>
   </w:abstractNum>
-  <w:abstractNum w:abstractNumId="4" w15:restartNumberingAfterBreak="0">
+  <w:abstractNum w:abstractNumId="7" w15:restartNumberingAfterBreak="0">
     <w:nsid w:val="4BBC3CE9"/>
     <w:multiLevelType w:val="multilevel"/>
     <w:tmpl w:val="071E7328"/>
@@ -1090,7 +2111,7 @@
       </w:pPr>
     </w:lvl>
   </w:abstractNum>
-  <w:abstractNum w:abstractNumId="5" w15:restartNumberingAfterBreak="0">
+  <w:abstractNum w:abstractNumId="8" w15:restartNumberingAfterBreak="0">
     <w:nsid w:val="5A80354F"/>
     <w:multiLevelType w:val="multilevel"/>
     <w:tmpl w:val="B9B4BCDA"/>
@@ -1239,7 +2260,7 @@
       </w:rPr>
     </w:lvl>
   </w:abstractNum>
-  <w:abstractNum w:abstractNumId="6" w15:restartNumberingAfterBreak="0">
+  <w:abstractNum w:abstractNumId="9" w15:restartNumberingAfterBreak="0">
     <w:nsid w:val="61680E09"/>
     <w:multiLevelType w:val="multilevel"/>
     <w:tmpl w:val="63AC1860"/>
@@ -1388,7 +2409,7 @@
       </w:rPr>
     </w:lvl>
   </w:abstractNum>
-  <w:abstractNum w:abstractNumId="7" w15:restartNumberingAfterBreak="0">
+  <w:abstractNum w:abstractNumId="10" w15:restartNumberingAfterBreak="0">
     <w:nsid w:val="6B3D5065"/>
     <w:multiLevelType w:val="multilevel"/>
     <w:tmpl w:val="06BCBD8E"/>
@@ -1505,29 +2526,190 @@
       </w:pPr>
     </w:lvl>
   </w:abstractNum>
+  <w:abstractNum w:abstractNumId="11" w15:restartNumberingAfterBreak="0">
+    <w:nsid w:val="79B84F41"/>
+    <w:multiLevelType w:val="multilevel"/>
+    <w:tmpl w:val="60B6B71C"/>
+    <w:lvl w:ilvl="0">
+      <w:start w:val="1"/>
+      <w:numFmt w:val="bullet"/>
+      <w:lvlText w:val=""/>
+      <w:lvlJc w:val="left"/>
+      <w:pPr>
+        <w:tabs>
+          <w:tab w:val="num" w:pos="720"/>
+        </w:tabs>
+        <w:ind w:left="720" w:hanging="360"/>
+      </w:pPr>
+      <w:rPr>
+        <w:rFonts w:ascii="Symbol" w:hAnsi="Symbol" w:hint="default"/>
+        <w:sz w:val="20"/>
+      </w:rPr>
+    </w:lvl>
+    <w:lvl w:ilvl="1" w:tentative="1">
+      <w:start w:val="1"/>
+      <w:numFmt w:val="bullet"/>
+      <w:lvlText w:val="o"/>
+      <w:lvlJc w:val="left"/>
+      <w:pPr>
+        <w:tabs>
+          <w:tab w:val="num" w:pos="1440"/>
+        </w:tabs>
+        <w:ind w:left="1440" w:hanging="360"/>
+      </w:pPr>
+      <w:rPr>
+        <w:rFonts w:ascii="Courier New" w:hAnsi="Courier New" w:hint="default"/>
+        <w:sz w:val="20"/>
+      </w:rPr>
+    </w:lvl>
+    <w:lvl w:ilvl="2" w:tentative="1">
+      <w:start w:val="1"/>
+      <w:numFmt w:val="bullet"/>
+      <w:lvlText w:val=""/>
+      <w:lvlJc w:val="left"/>
+      <w:pPr>
+        <w:tabs>
+          <w:tab w:val="num" w:pos="2160"/>
+        </w:tabs>
+        <w:ind w:left="2160" w:hanging="360"/>
+      </w:pPr>
+      <w:rPr>
+        <w:rFonts w:ascii="Wingdings" w:hAnsi="Wingdings" w:hint="default"/>
+        <w:sz w:val="20"/>
+      </w:rPr>
+    </w:lvl>
+    <w:lvl w:ilvl="3" w:tentative="1">
+      <w:start w:val="1"/>
+      <w:numFmt w:val="bullet"/>
+      <w:lvlText w:val=""/>
+      <w:lvlJc w:val="left"/>
+      <w:pPr>
+        <w:tabs>
+          <w:tab w:val="num" w:pos="2880"/>
+        </w:tabs>
+        <w:ind w:left="2880" w:hanging="360"/>
+      </w:pPr>
+      <w:rPr>
+        <w:rFonts w:ascii="Wingdings" w:hAnsi="Wingdings" w:hint="default"/>
+        <w:sz w:val="20"/>
+      </w:rPr>
+    </w:lvl>
+    <w:lvl w:ilvl="4" w:tentative="1">
+      <w:start w:val="1"/>
+      <w:numFmt w:val="bullet"/>
+      <w:lvlText w:val=""/>
+      <w:lvlJc w:val="left"/>
+      <w:pPr>
+        <w:tabs>
+          <w:tab w:val="num" w:pos="3600"/>
+        </w:tabs>
+        <w:ind w:left="3600" w:hanging="360"/>
+      </w:pPr>
+      <w:rPr>
+        <w:rFonts w:ascii="Wingdings" w:hAnsi="Wingdings" w:hint="default"/>
+        <w:sz w:val="20"/>
+      </w:rPr>
+    </w:lvl>
+    <w:lvl w:ilvl="5" w:tentative="1">
+      <w:start w:val="1"/>
+      <w:numFmt w:val="bullet"/>
+      <w:lvlText w:val=""/>
+      <w:lvlJc w:val="left"/>
+      <w:pPr>
+        <w:tabs>
+          <w:tab w:val="num" w:pos="4320"/>
+        </w:tabs>
+        <w:ind w:left="4320" w:hanging="360"/>
+      </w:pPr>
+      <w:rPr>
+        <w:rFonts w:ascii="Wingdings" w:hAnsi="Wingdings" w:hint="default"/>
+        <w:sz w:val="20"/>
+      </w:rPr>
+    </w:lvl>
+    <w:lvl w:ilvl="6" w:tentative="1">
+      <w:start w:val="1"/>
+      <w:numFmt w:val="bullet"/>
+      <w:lvlText w:val=""/>
+      <w:lvlJc w:val="left"/>
+      <w:pPr>
+        <w:tabs>
+          <w:tab w:val="num" w:pos="5040"/>
+        </w:tabs>
+        <w:ind w:left="5040" w:hanging="360"/>
+      </w:pPr>
+      <w:rPr>
+        <w:rFonts w:ascii="Wingdings" w:hAnsi="Wingdings" w:hint="default"/>
+        <w:sz w:val="20"/>
+      </w:rPr>
+    </w:lvl>
+    <w:lvl w:ilvl="7" w:tentative="1">
+      <w:start w:val="1"/>
+      <w:numFmt w:val="bullet"/>
+      <w:lvlText w:val=""/>
+      <w:lvlJc w:val="left"/>
+      <w:pPr>
+        <w:tabs>
+          <w:tab w:val="num" w:pos="5760"/>
+        </w:tabs>
+        <w:ind w:left="5760" w:hanging="360"/>
+      </w:pPr>
+      <w:rPr>
+        <w:rFonts w:ascii="Wingdings" w:hAnsi="Wingdings" w:hint="default"/>
+        <w:sz w:val="20"/>
+      </w:rPr>
+    </w:lvl>
+    <w:lvl w:ilvl="8" w:tentative="1">
+      <w:start w:val="1"/>
+      <w:numFmt w:val="bullet"/>
+      <w:lvlText w:val=""/>
+      <w:lvlJc w:val="left"/>
+      <w:pPr>
+        <w:tabs>
+          <w:tab w:val="num" w:pos="6480"/>
+        </w:tabs>
+        <w:ind w:left="6480" w:hanging="360"/>
+      </w:pPr>
+      <w:rPr>
+        <w:rFonts w:ascii="Wingdings" w:hAnsi="Wingdings" w:hint="default"/>
+        <w:sz w:val="20"/>
+      </w:rPr>
+    </w:lvl>
+  </w:abstractNum>
   <w:num w:numId="1" w16cid:durableId="377969489">
-    <w:abstractNumId w:val="3"/>
+    <w:abstractNumId w:val="6"/>
   </w:num>
   <w:num w:numId="2" w16cid:durableId="545683410">
     <w:abstractNumId w:val="0"/>
   </w:num>
   <w:num w:numId="3" w16cid:durableId="1214387622">
+    <w:abstractNumId w:val="4"/>
+  </w:num>
+  <w:num w:numId="4" w16cid:durableId="892933426">
+    <w:abstractNumId w:val="10"/>
+  </w:num>
+  <w:num w:numId="5" w16cid:durableId="450435856">
+    <w:abstractNumId w:val="7"/>
+  </w:num>
+  <w:num w:numId="6" w16cid:durableId="730735578">
+    <w:abstractNumId w:val="5"/>
+  </w:num>
+  <w:num w:numId="7" w16cid:durableId="1317412911">
+    <w:abstractNumId w:val="9"/>
+  </w:num>
+  <w:num w:numId="8" w16cid:durableId="1327629733">
+    <w:abstractNumId w:val="8"/>
+  </w:num>
+  <w:num w:numId="9" w16cid:durableId="791441489">
     <w:abstractNumId w:val="1"/>
   </w:num>
-  <w:num w:numId="4" w16cid:durableId="892933426">
-    <w:abstractNumId w:val="7"/>
+  <w:num w:numId="10" w16cid:durableId="257567365">
+    <w:abstractNumId w:val="3"/>
   </w:num>
-  <w:num w:numId="5" w16cid:durableId="450435856">
-    <w:abstractNumId w:val="4"/>
+  <w:num w:numId="11" w16cid:durableId="270161350">
+    <w:abstractNumId w:val="11"/>
   </w:num>
-  <w:num w:numId="6" w16cid:durableId="730735578">
+  <w:num w:numId="12" w16cid:durableId="1940487086">
     <w:abstractNumId w:val="2"/>
-  </w:num>
-  <w:num w:numId="7" w16cid:durableId="1317412911">
-    <w:abstractNumId w:val="6"/>
-  </w:num>
-  <w:num w:numId="8" w16cid:durableId="1327629733">
-    <w:abstractNumId w:val="5"/>
   </w:num>
 </w:numbering>
 </file>
@@ -2347,6 +3529,19 @@
       <w:spacing w:val="5"/>
     </w:rPr>
   </w:style>
+  <w:style w:type="paragraph" w:styleId="NormalWeb">
+    <w:name w:val="Normal (Web)"/>
+    <w:basedOn w:val="Normal"/>
+    <w:uiPriority w:val="99"/>
+    <w:semiHidden/>
+    <w:unhideWhenUsed/>
+    <w:rsid w:val="00F202CC"/>
+    <w:rPr>
+      <w:rFonts w:ascii="Times New Roman" w:hAnsi="Times New Roman" w:cs="Times New Roman"/>
+      <w:sz w:val="24"/>
+      <w:szCs w:val="24"/>
+    </w:rPr>
+  </w:style>
 </w:styles>
 </file>
 

</xml_diff>